<commit_message>
FEP Soccer Training App
</commit_message>
<xml_diff>
--- a/inflexion_index/Inflexion_Index_技術ドキュメント.docx
+++ b/inflexion_index/Inflexion_Index_技術ドキュメント.docx
@@ -376,7 +376,7 @@
           <w:sz w:val="22"/>
           <w:szCs w:val="22"/>
         </w:rPr>
-        <w:t>長期的な学習必要性と目標達成度の評価</w:t>
+        <w:t>将来に向けた見通しの悪さと動きにくさの評価（加算モデル v3）</w:t>
       </w:r>
     </w:p>
     <w:p>
@@ -9354,7 +9354,7 @@
           <w:sz w:val="26"/>
           <w:szCs w:val="26"/>
         </w:rPr>
-        <w:t>（期待自由エネルギー）</w:t>
+        <w:t>（期待自由エネルギー） — 加算モデル v3</w:t>
       </w:r>
     </w:p>
     <w:p>
@@ -9582,7 +9582,7 @@
                 <w:sz w:val="20"/>
                 <w:szCs w:val="20"/>
               </w:rPr>
-              <w:t>現在の状態不確実性</w:t>
+              <w:t>Q1: 不明確さ</w:t>
             </w:r>
           </w:p>
         </w:tc>
@@ -9634,7 +9634,7 @@
                 <w:sz w:val="20"/>
                 <w:szCs w:val="20"/>
               </w:rPr>
-              <w:t>現在の状態はどの程度不確実か？</w:t>
+              <w:t>不明確さ（0=見えている, 10=分からない）</w:t>
             </w:r>
           </w:p>
         </w:tc>
@@ -9695,7 +9695,7 @@
                 <w:sz w:val="20"/>
                 <w:szCs w:val="20"/>
               </w:rPr>
-              <w:t>情報探索欲求</w:t>
+              <w:t>Q2: 情報を求めなさ</w:t>
             </w:r>
           </w:p>
         </w:tc>
@@ -9745,23 +9745,7 @@
                 <w:sz w:val="20"/>
                 <w:szCs w:val="20"/>
               </w:rPr>
-              <w:t>情報を探索</w:t>
-            </w:r>
-            <w:r>
-              <w:rPr>
-                <w:rFonts w:eastAsia="Arial" w:cs="Arial"/>
-                <w:sz w:val="20"/>
-                <w:szCs w:val="20"/>
-              </w:rPr>
-              <w:t>/</w:t>
-            </w:r>
-            <w:r>
-              <w:rPr>
-                <w:rFonts w:ascii="Arial" w:hAnsi="Arial" w:cs="Arial"/>
-                <w:sz w:val="20"/>
-                <w:szCs w:val="20"/>
-              </w:rPr>
-              <w:t>学習したいか？（反転）</w:t>
+              <w:t>情報を求めなさ（0=知りたい, 10=求めていない）</w:t>
             </w:r>
           </w:p>
         </w:tc>
@@ -9824,7 +9808,7 @@
                 <w:sz w:val="20"/>
                 <w:szCs w:val="20"/>
               </w:rPr>
-              <w:t>目標の重要度</w:t>
+              <w:t>Q3: 目標優先度の低さ</w:t>
             </w:r>
           </w:p>
         </w:tc>
@@ -9876,7 +9860,7 @@
                 <w:sz w:val="20"/>
                 <w:szCs w:val="20"/>
               </w:rPr>
-              <w:t>目標はどの程度重要か？（反転）</w:t>
+              <w:t>目標優先度の低さ（0=大切, 10=優先ではない）</w:t>
             </w:r>
           </w:p>
         </w:tc>
@@ -9937,7 +9921,7 @@
                 <w:sz w:val="20"/>
                 <w:szCs w:val="20"/>
               </w:rPr>
-              <w:t>実行コスト</w:t>
+              <w:t>Q4: 取り組みにくさ</w:t>
             </w:r>
           </w:p>
         </w:tc>
@@ -9987,7 +9971,7 @@
                 <w:sz w:val="20"/>
                 <w:szCs w:val="20"/>
               </w:rPr>
-              <w:t>行動の実現可能性は？（反転）</w:t>
+              <w:t>取り組みにくさ（0=取り組める, 10=動けない）</w:t>
             </w:r>
           </w:p>
         </w:tc>
@@ -10047,7 +10031,7 @@
           <w:sz w:val="20"/>
           <w:szCs w:val="20"/>
         </w:rPr>
-        <w:t>epi = epiQ1 * (10 - epiQ2) / 10</w:t>
+        <w:t>epi_score = (q1 + q2) / 2</w:t>
       </w:r>
     </w:p>
     <w:p>
@@ -10065,7 +10049,7 @@
           <w:sz w:val="20"/>
           <w:szCs w:val="20"/>
         </w:rPr>
-        <w:t>pra = (10 - praQ3) * (10 - praQ4) / 10</w:t>
+        <w:t>pra_score = (q3 + q4) / 2</w:t>
       </w:r>
     </w:p>
     <w:p>
@@ -10083,7 +10067,7 @@
           <w:sz w:val="20"/>
           <w:szCs w:val="20"/>
         </w:rPr>
-        <w:t>alpha = rescale(10 - epiQ2, [0,10], [0.5, 2.0])</w:t>
+        <w:t>efe_score = (epi_score + pra_score) / 2</w:t>
       </w:r>
     </w:p>
     <w:p>
@@ -10101,7 +10085,7 @@
           <w:sz w:val="20"/>
           <w:szCs w:val="20"/>
         </w:rPr>
-        <w:t>beta  = rescale(10 - praQ3, [0,10], [0.5, 2.0])</w:t>
+        <w:t>EFE_display = efe_score * 10</w:t>
       </w:r>
     </w:p>
     <w:p>
@@ -10119,7 +10103,7 @@
           <w:sz w:val="20"/>
           <w:szCs w:val="20"/>
         </w:rPr>
-        <w:t>epi_c = tanh((epi - 5) / 2.5)</w:t>
+        <w:t>dominant = epistemic if epi - pra &gt; 1.5, pragmatic if pra - epi &gt; 1.5, else balanced</w:t>
       </w:r>
     </w:p>
     <w:p>
@@ -10137,7 +10121,7 @@
           <w:sz w:val="20"/>
           <w:szCs w:val="20"/>
         </w:rPr>
-        <w:t>pra_c = tanh((pra - 5) / 2.5)</w:t>
+        <w:t>(epi_score: ambiguity / 認識的負荷)</w:t>
       </w:r>
     </w:p>
     <w:p>
@@ -10155,7 +10139,7 @@
           <w:sz w:val="20"/>
           <w:szCs w:val="20"/>
         </w:rPr>
-        <w:t>EFE_raw = -alpha * epi_c - beta * pra_c</w:t>
+        <w:t>(pra_score: risk / 実行的負荷)</w:t>
       </w:r>
     </w:p>
     <w:p>
@@ -10173,7 +10157,7 @@
           <w:sz w:val="20"/>
           <w:szCs w:val="20"/>
         </w:rPr>
-        <w:t>EFE_display = rescale(EFE_raw, [-max_raw, max_raw], [100, 0])</w:t>
+        <w:t>(EFE_display: 0-100, 高いほど見通しが悪く動きにくい)</w:t>
       </w:r>
     </w:p>
     <w:p>
@@ -10228,7 +10212,7 @@
           <w:sz w:val="22"/>
           <w:szCs w:val="22"/>
         </w:rPr>
-        <w:t>に近い）ほど不確実性が高く、さらなる学習が必要です。</w:t>
+        <w:t>が高いほど見通しが悪く動きにくい。0-20: とても低い（明確で前向き）, 21-40: 低い, 41-60: 中等度, 61-80: 高い, 81-100: とても高い（曖昧で動きにくい）。加算モデル v3 により全設問 0=良い / 10=悪い に統一。</w:t>
       </w:r>
     </w:p>
     <w:p>
@@ -14944,7 +14928,7 @@
                 <w:sz w:val="20"/>
                 <w:szCs w:val="20"/>
               </w:rPr>
-              <w:t>, α, β, σ, λ, τ, EFE_display, efe_raw, efe_adj</w:t>
+              <w:t>, epi_score, pra_score, dominant, σ, λ, τ, EFE_display, efe_raw</w:t>
             </w:r>
           </w:p>
         </w:tc>

</xml_diff>